<commit_message>
Finished Find Peak Element
</commit_message>
<xml_diff>
--- a/Roadmap.docx
+++ b/Roadmap.docx
@@ -1176,11 +1176,13 @@
         </w:numPr>
         <w:rPr>
           <w:rFonts w:cs="Segoe UI Emoji"/>
-        </w:rPr>
-      </w:pPr>
-      <w:r>
-        <w:rPr>
-          <w:rFonts w:cs="Segoe UI Emoji"/>
+          <w:highlight w:val="yellow"/>
+        </w:rPr>
+      </w:pPr>
+      <w:r>
+        <w:rPr>
+          <w:rFonts w:cs="Segoe UI Emoji"/>
+          <w:highlight w:val="yellow"/>
         </w:rPr>
         <w:t xml:space="preserve">First Bad Version </w:t>
       </w:r>
@@ -1193,11 +1195,13 @@
         </w:numPr>
         <w:rPr>
           <w:rFonts w:cs="Segoe UI Emoji"/>
-        </w:rPr>
-      </w:pPr>
-      <w:r>
-        <w:rPr>
-          <w:rFonts w:cs="Segoe UI Emoji"/>
+          <w:highlight w:val="yellow"/>
+        </w:rPr>
+      </w:pPr>
+      <w:r>
+        <w:rPr>
+          <w:rFonts w:cs="Segoe UI Emoji"/>
+          <w:highlight w:val="yellow"/>
         </w:rPr>
         <w:t xml:space="preserve">Guess Number Higher or Lower </w:t>
       </w:r>
@@ -1210,11 +1214,13 @@
         </w:numPr>
         <w:rPr>
           <w:rFonts w:cs="Segoe UI Emoji"/>
-        </w:rPr>
-      </w:pPr>
-      <w:r>
-        <w:rPr>
-          <w:rFonts w:cs="Segoe UI Emoji"/>
+          <w:highlight w:val="yellow"/>
+        </w:rPr>
+      </w:pPr>
+      <w:r>
+        <w:rPr>
+          <w:rFonts w:cs="Segoe UI Emoji"/>
+          <w:highlight w:val="yellow"/>
         </w:rPr>
         <w:t xml:space="preserve">Search in Rotated Sorted Array (medium) </w:t>
       </w:r>
@@ -1227,11 +1233,13 @@
         </w:numPr>
         <w:rPr>
           <w:rFonts w:cs="Segoe UI Emoji"/>
-        </w:rPr>
-      </w:pPr>
-      <w:r>
-        <w:rPr>
-          <w:rFonts w:cs="Segoe UI Emoji"/>
+          <w:highlight w:val="yellow"/>
+        </w:rPr>
+      </w:pPr>
+      <w:r>
+        <w:rPr>
+          <w:rFonts w:cs="Segoe UI Emoji"/>
+          <w:highlight w:val="yellow"/>
         </w:rPr>
         <w:t xml:space="preserve">Find Peak Element </w:t>
       </w:r>
@@ -1393,7 +1401,7 @@
           <w:rFonts w:cs="Segoe UI Emoji"/>
         </w:rPr>
         <w:pict w14:anchorId="0201DD96">
-          <v:rect id="_x0000_i1067" style="width:0;height:1.5pt" o:hralign="center" o:hrstd="t" o:hr="t" fillcolor="#a0a0a0" stroked="f"/>
+          <v:rect id="_x0000_i1031" style="width:0;height:1.5pt" o:hralign="center" o:hrstd="t" o:hr="t" fillcolor="#a0a0a0" stroked="f"/>
         </w:pict>
       </w:r>
     </w:p>
@@ -1524,21 +1532,7 @@
         <w:rPr>
           <w:rFonts w:cs="Segoe UI Emoji"/>
         </w:rPr>
-        <w:t xml:space="preserve">Remove Nth Node </w:t>
-      </w:r>
-      <w:proofErr w:type="gramStart"/>
-      <w:r>
-        <w:rPr>
-          <w:rFonts w:cs="Segoe UI Emoji"/>
-        </w:rPr>
-        <w:t>From</w:t>
-      </w:r>
-      <w:proofErr w:type="gramEnd"/>
-      <w:r>
-        <w:rPr>
-          <w:rFonts w:cs="Segoe UI Emoji"/>
-        </w:rPr>
-        <w:t xml:space="preserve"> End (medium) </w:t>
+        <w:t xml:space="preserve">Remove Nth Node From End (medium) </w:t>
       </w:r>
     </w:p>
     <w:p>
@@ -1663,7 +1657,7 @@
           <w:rFonts w:cs="Segoe UI Emoji"/>
         </w:rPr>
         <w:pict w14:anchorId="1C9E715A">
-          <v:rect id="_x0000_i1068" style="width:0;height:1.5pt" o:hralign="center" o:hrstd="t" o:hr="t" fillcolor="#a0a0a0" stroked="f"/>
+          <v:rect id="_x0000_i1032" style="width:0;height:1.5pt" o:hralign="center" o:hrstd="t" o:hr="t" fillcolor="#a0a0a0" stroked="f"/>
         </w:pict>
       </w:r>
     </w:p>
@@ -1954,7 +1948,7 @@
           <w:rFonts w:cs="Segoe UI Emoji"/>
         </w:rPr>
         <w:pict w14:anchorId="056F4379">
-          <v:rect id="_x0000_i1069" style="width:0;height:1.5pt" o:hralign="center" o:hrstd="t" o:hr="t" fillcolor="#a0a0a0" stroked="f"/>
+          <v:rect id="_x0000_i1033" style="width:0;height:1.5pt" o:hralign="center" o:hrstd="t" o:hr="t" fillcolor="#a0a0a0" stroked="f"/>
         </w:pict>
       </w:r>
     </w:p>
@@ -2210,7 +2204,7 @@
           <w:rFonts w:cs="Segoe UI Emoji"/>
         </w:rPr>
         <w:pict w14:anchorId="187C1ECC">
-          <v:rect id="_x0000_i1070" style="width:0;height:1.5pt" o:hralign="center" o:hrstd="t" o:hr="t" fillcolor="#a0a0a0" stroked="f"/>
+          <v:rect id="_x0000_i1034" style="width:0;height:1.5pt" o:hralign="center" o:hrstd="t" o:hr="t" fillcolor="#a0a0a0" stroked="f"/>
         </w:pict>
       </w:r>
     </w:p>
@@ -2450,7 +2444,7 @@
           <w:rFonts w:cs="Segoe UI Emoji"/>
         </w:rPr>
         <w:pict w14:anchorId="6CB64788">
-          <v:rect id="_x0000_i1071" style="width:0;height:1.5pt" o:hralign="center" o:hrstd="t" o:hr="t" fillcolor="#a0a0a0" stroked="f"/>
+          <v:rect id="_x0000_i1035" style="width:0;height:1.5pt" o:hralign="center" o:hrstd="t" o:hr="t" fillcolor="#a0a0a0" stroked="f"/>
         </w:pict>
       </w:r>
     </w:p>
@@ -2741,7 +2735,7 @@
           <w:rFonts w:cs="Segoe UI Emoji"/>
         </w:rPr>
         <w:pict w14:anchorId="27E31AED">
-          <v:rect id="_x0000_i1072" style="width:0;height:1.5pt" o:hralign="center" o:hrstd="t" o:hr="t" fillcolor="#a0a0a0" stroked="f"/>
+          <v:rect id="_x0000_i1036" style="width:0;height:1.5pt" o:hralign="center" o:hrstd="t" o:hr="t" fillcolor="#a0a0a0" stroked="f"/>
         </w:pict>
       </w:r>
     </w:p>
@@ -2898,19 +2892,11 @@
           <w:rFonts w:cs="Segoe UI Emoji"/>
         </w:rPr>
       </w:pPr>
-      <w:proofErr w:type="spellStart"/>
-      <w:r>
-        <w:rPr>
-          <w:rFonts w:cs="Segoe UI Emoji"/>
-        </w:rPr>
-        <w:t>Memoization</w:t>
-      </w:r>
-      <w:proofErr w:type="spellEnd"/>
-      <w:r>
-        <w:rPr>
-          <w:rFonts w:cs="Segoe UI Emoji"/>
-        </w:rPr>
-        <w:t xml:space="preserve"> </w:t>
+      <w:r>
+        <w:rPr>
+          <w:rFonts w:cs="Segoe UI Emoji"/>
+        </w:rPr>
+        <w:t xml:space="preserve">Memoization </w:t>
       </w:r>
     </w:p>
     <w:p>

</xml_diff>

<commit_message>
Finished Phase 9: Trees
</commit_message>
<xml_diff>
--- a/Roadmap.docx
+++ b/Roadmap.docx
@@ -1783,11 +1783,13 @@
         </w:numPr>
         <w:rPr>
           <w:rFonts w:cs="Segoe UI Emoji"/>
-        </w:rPr>
-      </w:pPr>
-      <w:r>
-        <w:rPr>
-          <w:rFonts w:cs="Segoe UI Emoji"/>
+          <w:highlight w:val="yellow"/>
+        </w:rPr>
+      </w:pPr>
+      <w:r>
+        <w:rPr>
+          <w:rFonts w:cs="Segoe UI Emoji"/>
+          <w:highlight w:val="yellow"/>
         </w:rPr>
         <w:t xml:space="preserve">Symmetric Tree </w:t>
       </w:r>

</xml_diff>

<commit_message>
Finished Phase 10: Heaps
</commit_message>
<xml_diff>
--- a/Roadmap.docx
+++ b/Roadmap.docx
@@ -1802,11 +1802,13 @@
         </w:numPr>
         <w:rPr>
           <w:rFonts w:cs="Segoe UI Emoji"/>
-        </w:rPr>
-      </w:pPr>
-      <w:r>
-        <w:rPr>
-          <w:rFonts w:cs="Segoe UI Emoji"/>
+          <w:highlight w:val="yellow"/>
+        </w:rPr>
+      </w:pPr>
+      <w:r>
+        <w:rPr>
+          <w:rFonts w:cs="Segoe UI Emoji"/>
+          <w:highlight w:val="yellow"/>
         </w:rPr>
         <w:lastRenderedPageBreak/>
         <w:t xml:space="preserve">Path Sum </w:t>
@@ -1820,11 +1822,13 @@
         </w:numPr>
         <w:rPr>
           <w:rFonts w:cs="Segoe UI Emoji"/>
-        </w:rPr>
-      </w:pPr>
-      <w:r>
-        <w:rPr>
-          <w:rFonts w:cs="Segoe UI Emoji"/>
+          <w:highlight w:val="yellow"/>
+        </w:rPr>
+      </w:pPr>
+      <w:r>
+        <w:rPr>
+          <w:rFonts w:cs="Segoe UI Emoji"/>
+          <w:highlight w:val="yellow"/>
         </w:rPr>
         <w:t xml:space="preserve">Binary Tree Level Order Traversal (medium) </w:t>
       </w:r>
@@ -2025,11 +2029,13 @@
         </w:numPr>
         <w:rPr>
           <w:rFonts w:cs="Segoe UI Emoji"/>
-        </w:rPr>
-      </w:pPr>
-      <w:r>
-        <w:rPr>
-          <w:rFonts w:cs="Segoe UI Emoji"/>
+          <w:highlight w:val="yellow"/>
+        </w:rPr>
+      </w:pPr>
+      <w:r>
+        <w:rPr>
+          <w:rFonts w:cs="Segoe UI Emoji"/>
+          <w:highlight w:val="yellow"/>
         </w:rPr>
         <w:t xml:space="preserve">Kth Largest Element </w:t>
       </w:r>
@@ -2042,11 +2048,13 @@
         </w:numPr>
         <w:rPr>
           <w:rFonts w:cs="Segoe UI Emoji"/>
-        </w:rPr>
-      </w:pPr>
-      <w:r>
-        <w:rPr>
-          <w:rFonts w:cs="Segoe UI Emoji"/>
+          <w:highlight w:val="yellow"/>
+        </w:rPr>
+      </w:pPr>
+      <w:r>
+        <w:rPr>
+          <w:rFonts w:cs="Segoe UI Emoji"/>
+          <w:highlight w:val="yellow"/>
         </w:rPr>
         <w:t xml:space="preserve">Last Stone Weight </w:t>
       </w:r>
@@ -2059,11 +2067,13 @@
         </w:numPr>
         <w:rPr>
           <w:rFonts w:cs="Segoe UI Emoji"/>
-        </w:rPr>
-      </w:pPr>
-      <w:r>
-        <w:rPr>
-          <w:rFonts w:cs="Segoe UI Emoji"/>
+          <w:highlight w:val="yellow"/>
+        </w:rPr>
+      </w:pPr>
+      <w:r>
+        <w:rPr>
+          <w:rFonts w:cs="Segoe UI Emoji"/>
+          <w:highlight w:val="yellow"/>
         </w:rPr>
         <w:t xml:space="preserve">Top K Frequent Elements </w:t>
       </w:r>
@@ -2076,13 +2086,29 @@
         </w:numPr>
         <w:rPr>
           <w:rFonts w:cs="Segoe UI Emoji"/>
-        </w:rPr>
-      </w:pPr>
-      <w:r>
-        <w:rPr>
-          <w:rFonts w:cs="Segoe UI Emoji"/>
-        </w:rPr>
-        <w:t xml:space="preserve">Merge K Sorted Lists (medium) </w:t>
+          <w:highlight w:val="yellow"/>
+        </w:rPr>
+      </w:pPr>
+      <w:r>
+        <w:rPr>
+          <w:rFonts w:cs="Segoe UI Emoji"/>
+          <w:highlight w:val="yellow"/>
+        </w:rPr>
+        <w:t>Merge K Sorted Lists (</w:t>
+      </w:r>
+      <w:r>
+        <w:rPr>
+          <w:rFonts w:cs="Segoe UI Emoji"/>
+          <w:highlight w:val="yellow"/>
+        </w:rPr>
+        <w:t>hard</w:t>
+      </w:r>
+      <w:r>
+        <w:rPr>
+          <w:rFonts w:cs="Segoe UI Emoji"/>
+          <w:highlight w:val="yellow"/>
+        </w:rPr>
+        <w:t xml:space="preserve">) </w:t>
       </w:r>
     </w:p>
     <w:p>

</xml_diff>

<commit_message>
Finished Find if Path Exists
</commit_message>
<xml_diff>
--- a/Roadmap.docx
+++ b/Roadmap.docx
@@ -2611,11 +2611,13 @@
         </w:numPr>
         <w:rPr>
           <w:rFonts w:cs="Segoe UI Emoji"/>
-        </w:rPr>
-      </w:pPr>
-      <w:r>
-        <w:rPr>
-          <w:rFonts w:cs="Segoe UI Emoji"/>
+          <w:highlight w:val="yellow"/>
+        </w:rPr>
+      </w:pPr>
+      <w:r>
+        <w:rPr>
+          <w:rFonts w:cs="Segoe UI Emoji"/>
+          <w:highlight w:val="yellow"/>
         </w:rPr>
         <w:t xml:space="preserve">Number of Islands </w:t>
       </w:r>
@@ -2628,11 +2630,13 @@
         </w:numPr>
         <w:rPr>
           <w:rFonts w:cs="Segoe UI Emoji"/>
-        </w:rPr>
-      </w:pPr>
-      <w:r>
-        <w:rPr>
-          <w:rFonts w:cs="Segoe UI Emoji"/>
+          <w:highlight w:val="yellow"/>
+        </w:rPr>
+      </w:pPr>
+      <w:r>
+        <w:rPr>
+          <w:rFonts w:cs="Segoe UI Emoji"/>
+          <w:highlight w:val="yellow"/>
         </w:rPr>
         <w:t xml:space="preserve">Find if Path Exists </w:t>
       </w:r>

</xml_diff>

<commit_message>
Finished Phase 12: Graph
</commit_message>
<xml_diff>
--- a/Roadmap.docx
+++ b/Roadmap.docx
@@ -1,6 +1,6 @@
 
 <file path=word/document.xml><?xml version="1.0" encoding="utf-8"?>
-<w:document xmlns:wpc="http://schemas.microsoft.com/office/word/2010/wordprocessingCanvas" xmlns:cx="http://schemas.microsoft.com/office/drawing/2014/chartex" xmlns:cx1="http://schemas.microsoft.com/office/drawing/2015/9/8/chartex" xmlns:cx2="http://schemas.microsoft.com/office/drawing/2015/10/21/chartex" xmlns:cx3="http://schemas.microsoft.com/office/drawing/2016/5/9/chartex" xmlns:cx4="http://schemas.microsoft.com/office/drawing/2016/5/10/chartex" xmlns:cx5="http://schemas.microsoft.com/office/drawing/2016/5/11/chartex" xmlns:cx6="http://schemas.microsoft.com/office/drawing/2016/5/12/chartex" xmlns:cx7="http://schemas.microsoft.com/office/drawing/2016/5/13/chartex" xmlns:cx8="http://schemas.microsoft.com/office/drawing/2016/5/14/chartex" xmlns:mc="http://schemas.openxmlformats.org/markup-compatibility/2006" xmlns:aink="http://schemas.microsoft.com/office/drawing/2016/ink" xmlns:am3d="http://schemas.microsoft.com/office/drawing/2017/model3d" xmlns:o="urn:schemas-microsoft-com:office:office" xmlns:oel="http://schemas.microsoft.com/office/2019/extlst" xmlns:r="http://schemas.openxmlformats.org/officeDocument/2006/relationships" xmlns:m="http://schemas.openxmlformats.org/officeDocument/2006/math" xmlns:v="urn:schemas-microsoft-com:vml" xmlns:wp14="http://schemas.microsoft.com/office/word/2010/wordprocessingDrawing" xmlns:wp="http://schemas.openxmlformats.org/drawingml/2006/wordprocessingDrawing" xmlns:w10="urn:schemas-microsoft-com:office:word" xmlns:w="http://schemas.openxmlformats.org/wordprocessingml/2006/main" xmlns:w14="http://schemas.microsoft.com/office/word/2010/wordml" xmlns:w15="http://schemas.microsoft.com/office/word/2012/wordml" xmlns:w16cex="http://schemas.microsoft.com/office/word/2018/wordml/cex" xmlns:w16cid="http://schemas.microsoft.com/office/word/2016/wordml/cid" xmlns:w16="http://schemas.microsoft.com/office/word/2018/wordml" xmlns:w16du="http://schemas.microsoft.com/office/word/2023/wordml/word16du" xmlns:w16sdtdh="http://schemas.microsoft.com/office/word/2020/wordml/sdtdatahash" xmlns:w16sdtfl="http://schemas.microsoft.com/office/word/2024/wordml/sdtformatlock" xmlns:w16se="http://schemas.microsoft.com/office/word/2015/wordml/symex" xmlns:wpg="http://schemas.microsoft.com/office/word/2010/wordprocessingGroup" xmlns:wpi="http://schemas.microsoft.com/office/word/2010/wordprocessingInk" xmlns:wne="http://schemas.microsoft.com/office/word/2006/wordml" xmlns:wps="http://schemas.microsoft.com/office/word/2010/wordprocessingShape" mc:Ignorable="w14 w15 w16se w16cid w16 w16cex w16sdtdh w16sdtfl w16du wp14">
+<w:document xmlns:wpc="http://schemas.microsoft.com/office/word/2010/wordprocessingCanvas" xmlns:cx="http://schemas.microsoft.com/office/drawing/2014/chartex" xmlns:cx1="http://schemas.microsoft.com/office/drawing/2015/9/8/chartex" xmlns:cx2="http://schemas.microsoft.com/office/drawing/2015/10/21/chartex" xmlns:cx3="http://schemas.microsoft.com/office/drawing/2016/5/9/chartex" xmlns:cx4="http://schemas.microsoft.com/office/drawing/2016/5/10/chartex" xmlns:cx5="http://schemas.microsoft.com/office/drawing/2016/5/11/chartex" xmlns:cx6="http://schemas.microsoft.com/office/drawing/2016/5/12/chartex" xmlns:cx7="http://schemas.microsoft.com/office/drawing/2016/5/13/chartex" xmlns:cx8="http://schemas.microsoft.com/office/drawing/2016/5/14/chartex" xmlns:mc="http://schemas.openxmlformats.org/markup-compatibility/2006" xmlns:aink="http://schemas.microsoft.com/office/drawing/2016/ink" xmlns:am3d="http://schemas.microsoft.com/office/drawing/2017/model3d" xmlns:o="urn:schemas-microsoft-com:office:office" xmlns:oel="http://schemas.microsoft.com/office/2019/extlst" xmlns:r="http://schemas.openxmlformats.org/officeDocument/2006/relationships" xmlns:m="http://schemas.openxmlformats.org/officeDocument/2006/math" xmlns:v="urn:schemas-microsoft-com:vml" xmlns:wp14="http://schemas.microsoft.com/office/word/2010/wordprocessingDrawing" xmlns:wp="http://schemas.openxmlformats.org/drawingml/2006/wordprocessingDrawing" xmlns:w10="urn:schemas-microsoft-com:office:word" xmlns:w="http://schemas.openxmlformats.org/wordprocessingml/2006/main" xmlns:w14="http://schemas.microsoft.com/office/word/2010/wordml" xmlns:w15="http://schemas.microsoft.com/office/word/2012/wordml" xmlns:w16cei="http://schemas.microsoft.com/office/word/2026/wordml/cei" xmlns:w16cex="http://schemas.microsoft.com/office/word/2018/wordml/cex" xmlns:w16cid="http://schemas.microsoft.com/office/word/2016/wordml/cid" xmlns:w16="http://schemas.microsoft.com/office/word/2018/wordml" xmlns:w16du="http://schemas.microsoft.com/office/word/2023/wordml/word16du" xmlns:w16sdtdh="http://schemas.microsoft.com/office/word/2020/wordml/sdtdatahash" xmlns:w16sdtfl="http://schemas.microsoft.com/office/word/2024/wordml/sdtformatlock" xmlns:w16se="http://schemas.microsoft.com/office/word/2015/wordml/symex" xmlns:wpg="http://schemas.microsoft.com/office/word/2010/wordprocessingGroup" xmlns:wpi="http://schemas.microsoft.com/office/word/2010/wordprocessingInk" xmlns:wne="http://schemas.microsoft.com/office/word/2006/wordml" xmlns:wps="http://schemas.microsoft.com/office/word/2010/wordprocessingShape" mc:Ignorable="w14 w15 w16se w16cid w16 w16cex w16sdtdh w16sdtfl w16du wp14">
   <w:body>
     <w:p>
       <w:pPr>
@@ -2649,11 +2649,13 @@
         </w:numPr>
         <w:rPr>
           <w:rFonts w:cs="Segoe UI Emoji"/>
-        </w:rPr>
-      </w:pPr>
-      <w:r>
-        <w:rPr>
-          <w:rFonts w:cs="Segoe UI Emoji"/>
+          <w:highlight w:val="yellow"/>
+        </w:rPr>
+      </w:pPr>
+      <w:r>
+        <w:rPr>
+          <w:rFonts w:cs="Segoe UI Emoji"/>
+          <w:highlight w:val="yellow"/>
         </w:rPr>
         <w:t xml:space="preserve">Clone Graph </w:t>
       </w:r>
@@ -3089,7 +3091,7 @@
 </file>
 
 <file path=word/numbering.xml><?xml version="1.0" encoding="utf-8"?>
-<w:numbering xmlns:wpc="http://schemas.microsoft.com/office/word/2010/wordprocessingCanvas" xmlns:cx="http://schemas.microsoft.com/office/drawing/2014/chartex" xmlns:cx1="http://schemas.microsoft.com/office/drawing/2015/9/8/chartex" xmlns:cx2="http://schemas.microsoft.com/office/drawing/2015/10/21/chartex" xmlns:cx3="http://schemas.microsoft.com/office/drawing/2016/5/9/chartex" xmlns:cx4="http://schemas.microsoft.com/office/drawing/2016/5/10/chartex" xmlns:cx5="http://schemas.microsoft.com/office/drawing/2016/5/11/chartex" xmlns:cx6="http://schemas.microsoft.com/office/drawing/2016/5/12/chartex" xmlns:cx7="http://schemas.microsoft.com/office/drawing/2016/5/13/chartex" xmlns:cx8="http://schemas.microsoft.com/office/drawing/2016/5/14/chartex" xmlns:mc="http://schemas.openxmlformats.org/markup-compatibility/2006" xmlns:aink="http://schemas.microsoft.com/office/drawing/2016/ink" xmlns:am3d="http://schemas.microsoft.com/office/drawing/2017/model3d" xmlns:o="urn:schemas-microsoft-com:office:office" xmlns:oel="http://schemas.microsoft.com/office/2019/extlst" xmlns:r="http://schemas.openxmlformats.org/officeDocument/2006/relationships" xmlns:m="http://schemas.openxmlformats.org/officeDocument/2006/math" xmlns:v="urn:schemas-microsoft-com:vml" xmlns:wp14="http://schemas.microsoft.com/office/word/2010/wordprocessingDrawing" xmlns:wp="http://schemas.openxmlformats.org/drawingml/2006/wordprocessingDrawing" xmlns:w10="urn:schemas-microsoft-com:office:word" xmlns:w="http://schemas.openxmlformats.org/wordprocessingml/2006/main" xmlns:w14="http://schemas.microsoft.com/office/word/2010/wordml" xmlns:w15="http://schemas.microsoft.com/office/word/2012/wordml" xmlns:w16cex="http://schemas.microsoft.com/office/word/2018/wordml/cex" xmlns:w16cid="http://schemas.microsoft.com/office/word/2016/wordml/cid" xmlns:w16="http://schemas.microsoft.com/office/word/2018/wordml" xmlns:w16du="http://schemas.microsoft.com/office/word/2023/wordml/word16du" xmlns:w16sdtdh="http://schemas.microsoft.com/office/word/2020/wordml/sdtdatahash" xmlns:w16sdtfl="http://schemas.microsoft.com/office/word/2024/wordml/sdtformatlock" xmlns:w16se="http://schemas.microsoft.com/office/word/2015/wordml/symex" xmlns:wpg="http://schemas.microsoft.com/office/word/2010/wordprocessingGroup" xmlns:wpi="http://schemas.microsoft.com/office/word/2010/wordprocessingInk" xmlns:wne="http://schemas.microsoft.com/office/word/2006/wordml" xmlns:wps="http://schemas.microsoft.com/office/word/2010/wordprocessingShape" mc:Ignorable="w14 w15 w16se w16cid w16 w16cex w16sdtdh w16sdtfl w16du wp14">
+<w:numbering xmlns:wpc="http://schemas.microsoft.com/office/word/2010/wordprocessingCanvas" xmlns:cx="http://schemas.microsoft.com/office/drawing/2014/chartex" xmlns:cx1="http://schemas.microsoft.com/office/drawing/2015/9/8/chartex" xmlns:cx2="http://schemas.microsoft.com/office/drawing/2015/10/21/chartex" xmlns:cx3="http://schemas.microsoft.com/office/drawing/2016/5/9/chartex" xmlns:cx4="http://schemas.microsoft.com/office/drawing/2016/5/10/chartex" xmlns:cx5="http://schemas.microsoft.com/office/drawing/2016/5/11/chartex" xmlns:cx6="http://schemas.microsoft.com/office/drawing/2016/5/12/chartex" xmlns:cx7="http://schemas.microsoft.com/office/drawing/2016/5/13/chartex" xmlns:cx8="http://schemas.microsoft.com/office/drawing/2016/5/14/chartex" xmlns:mc="http://schemas.openxmlformats.org/markup-compatibility/2006" xmlns:aink="http://schemas.microsoft.com/office/drawing/2016/ink" xmlns:am3d="http://schemas.microsoft.com/office/drawing/2017/model3d" xmlns:o="urn:schemas-microsoft-com:office:office" xmlns:oel="http://schemas.microsoft.com/office/2019/extlst" xmlns:r="http://schemas.openxmlformats.org/officeDocument/2006/relationships" xmlns:m="http://schemas.openxmlformats.org/officeDocument/2006/math" xmlns:v="urn:schemas-microsoft-com:vml" xmlns:wp14="http://schemas.microsoft.com/office/word/2010/wordprocessingDrawing" xmlns:wp="http://schemas.openxmlformats.org/drawingml/2006/wordprocessingDrawing" xmlns:w10="urn:schemas-microsoft-com:office:word" xmlns:w="http://schemas.openxmlformats.org/wordprocessingml/2006/main" xmlns:w14="http://schemas.microsoft.com/office/word/2010/wordml" xmlns:w15="http://schemas.microsoft.com/office/word/2012/wordml" xmlns:w16cei="http://schemas.microsoft.com/office/word/2026/wordml/cei" xmlns:w16cex="http://schemas.microsoft.com/office/word/2018/wordml/cex" xmlns:w16cid="http://schemas.microsoft.com/office/word/2016/wordml/cid" xmlns:w16="http://schemas.microsoft.com/office/word/2018/wordml" xmlns:w16du="http://schemas.microsoft.com/office/word/2023/wordml/word16du" xmlns:w16sdtdh="http://schemas.microsoft.com/office/word/2020/wordml/sdtdatahash" xmlns:w16sdtfl="http://schemas.microsoft.com/office/word/2024/wordml/sdtformatlock" xmlns:w16se="http://schemas.microsoft.com/office/word/2015/wordml/symex" xmlns:wpg="http://schemas.microsoft.com/office/word/2010/wordprocessingGroup" xmlns:wpi="http://schemas.microsoft.com/office/word/2010/wordprocessingInk" xmlns:wne="http://schemas.microsoft.com/office/word/2006/wordml" xmlns:wps="http://schemas.microsoft.com/office/word/2010/wordprocessingShape" mc:Ignorable="w14 w15 w16se w16cid w16 w16cex w16sdtdh w16sdtfl w16du wp14">
   <w:abstractNum w:abstractNumId="0" w15:restartNumberingAfterBreak="0">
     <w:nsid w:val="03AC12D2"/>
     <w:multiLevelType w:val="multilevel"/>

</xml_diff>